<commit_message>
Clean repo with some duplicate files
</commit_message>
<xml_diff>
--- a/docs/pa/PA4/PA4-Group09/KaiKo_ML_Model_Evaluation_Report_PA4.docx
+++ b/docs/pa/PA4/PA4-Group09/KaiKo_ML_Model_Evaluation_Report_PA4.docx
@@ -4311,7 +4311,7 @@
           <w:p>
             <w:r/>
             <w:r>
-              <w:t>Log huấn luyện thô</w:t>
+              <w:t>Log huấn luyện</w:t>
             </w:r>
           </w:p>
         </w:tc>
@@ -4322,7 +4322,7 @@
           <w:p>
             <w:r/>
             <w:r>
-              <w:t>ai_model/raw_outputs.txt, ai_model/output.txt (bản cũ) + log Kaggle chu kỳ PA4</w:t>
+              <w:t>Output nhúng trong 2 notebook (cell đầu) + log Kaggle chu kỳ PA4</w:t>
             </w:r>
           </w:p>
         </w:tc>

</xml_diff>